<commit_message>
Update project status report by removing AI features
Refine the fit-gap analysis document by removing all AI-related features and recalculating the project status percentages.

Replit-Commit-Author: Agent
Replit-Commit-Session-Id: 0226671d-4d7c-40eb-9b18-8775578e8874
Replit-Commit-Checkpoint-Type: full_checkpoint
Replit-Commit-Event-Id: ce0d80ae-a69c-452f-8438-45248feb9064
Replit-Commit-Screenshot-Url: https://storage.googleapis.com/screenshot-production-us-central1/c82b66a8-f4a7-47f1-bdbd-9ebba5cc2312/0226671d-4d7c-40eb-9b18-8775578e8874/w5gSIjS
Replit-Helium-Checkpoint-Created: true
</commit_message>
<xml_diff>
--- a/exports/Fit-Gap-PSOhub-SecureProfit-Hub-2026-06-09.docx
+++ b/exports/Fit-Gap-PSOhub-SecureProfit-Hub-2026-06-09.docx
@@ -40,7 +40,7 @@
     </w:p>
     <w:p>
       <w:pPr>
-        <w:spacing w:after="160"/>
+        <w:spacing w:after="40"/>
       </w:pPr>
       <w:r>
         <w:rPr>
@@ -49,6 +49,19 @@
           <w:sz w:val="20"/>
         </w:rPr>
         <w:t>Sistem internal: SecureProfit Hub - PSA untuk konsultan keamanan TI (ITSEC, Indonesia)</w:t>
+      </w:r>
+    </w:p>
+    <w:p>
+      <w:pPr>
+        <w:spacing w:after="160"/>
+      </w:pPr>
+      <w:r>
+        <w:rPr>
+          <w:b w:val="0"/>
+          <w:color w:val="555555"/>
+          <w:sz w:val="18"/>
+        </w:rPr>
+        <w:t>Catatan: fitur berbasis AI tidak termasuk dalam lingkup analisis ini.</w:t>
       </w:r>
     </w:p>
     <w:p>
@@ -97,7 +110,7 @@
           <w:b w:val="0"/>
           <w:sz w:val="20"/>
         </w:rPr>
-        <w:t>Gap utama yang tersisa terkonsentrasi pada area AI Copilot, integrasi CRM/collaboration, modul kontrak multi-tipe + recurring invoice, SSO, quote/SOW e-signature, dan data warehouse - sebagian besar adalah fitur tier Enterprise PSOhub.</w:t>
+        <w:t>Gap utama yang tersisa terkonsentrasi pada area integrasi CRM/collaboration, modul kontrak multi-tipe + recurring invoice, SSO, quote/SOW e-signature, dan data warehouse - sebagian besar adalah fitur tier Enterprise PSOhub.</w:t>
       </w:r>
     </w:p>
     <w:p>
@@ -240,7 +253,7 @@
                 <w:b w:val="0"/>
                 <w:sz w:val="20"/>
               </w:rPr>
-              <w:t>41.5%</w:t>
+              <w:t>45.8%</w:t>
             </w:r>
           </w:p>
         </w:tc>
@@ -298,7 +311,7 @@
                 <w:b w:val="0"/>
                 <w:sz w:val="20"/>
               </w:rPr>
-              <w:t>26.4%</w:t>
+              <w:t>29.2%</w:t>
             </w:r>
           </w:p>
         </w:tc>
@@ -338,7 +351,7 @@
                 <w:b w:val="0"/>
                 <w:sz w:val="20"/>
               </w:rPr>
-              <w:t>17</w:t>
+              <w:t>12</w:t>
             </w:r>
           </w:p>
         </w:tc>
@@ -356,7 +369,7 @@
                 <w:b w:val="0"/>
                 <w:sz w:val="20"/>
               </w:rPr>
-              <w:t>32.1%</w:t>
+              <w:t>25.0%</w:t>
             </w:r>
           </w:p>
         </w:tc>
@@ -394,7 +407,7 @@
                 <w:b/>
                 <w:sz w:val="20"/>
               </w:rPr>
-              <w:t>53</w:t>
+              <w:t>48</w:t>
             </w:r>
           </w:p>
         </w:tc>
@@ -439,7 +452,7 @@
           <w:color w:val="555555"/>
           <w:sz w:val="18"/>
         </w:rPr>
-        <w:t>Perbandingan dengan analisis 23 Mei 2026 (40,4% Fit / 15,4% Partial / 44,2% Gap): porsi Fit &amp; Partial naik dan porsi Gap turun, mencerminkan kemajuan implementasi.</w:t>
+        <w:t>Fitur berbasis AI (AI Copilot, AI data analytics, AI charts, AI scheduling) dikeluarkan dari lingkup analisis atas permintaan.</w:t>
       </w:r>
     </w:p>
     <w:p>
@@ -2379,88 +2392,6 @@
                 <w:b/>
                 <w:sz w:val="18"/>
               </w:rPr>
-              <w:t>AI auto-scheduling resource</w:t>
-            </w:r>
-          </w:p>
-        </w:tc>
-        <w:tc>
-          <w:tcPr>
-            <w:tcW w:type="dxa" w:w="3168"/>
-          </w:tcPr>
-          <w:p>
-            <w:r/>
-            <w:r>
-              <w:rPr>
-                <w:b w:val="0"/>
-                <w:sz w:val="18"/>
-              </w:rPr>
-              <w:t>AI Scheduling (Enterprise) - auto-assign</w:t>
-            </w:r>
-          </w:p>
-        </w:tc>
-        <w:tc>
-          <w:tcPr>
-            <w:tcW w:type="dxa" w:w="3456"/>
-          </w:tcPr>
-          <w:p>
-            <w:r/>
-            <w:r>
-              <w:rPr>
-                <w:b w:val="0"/>
-                <w:sz w:val="18"/>
-              </w:rPr>
-              <w:t>Belum ada</w:t>
-            </w:r>
-          </w:p>
-        </w:tc>
-        <w:tc>
-          <w:tcPr>
-            <w:tcW w:type="dxa" w:w="1008"/>
-            <w:shd w:val="clear" w:color="auto" w:fill="DC2626"/>
-          </w:tcPr>
-          <w:p>
-            <w:pPr>
-              <w:jc w:val="center"/>
-            </w:pPr>
-            <w:r/>
-            <w:r>
-              <w:rPr>
-                <w:b/>
-                <w:color w:val="FFFFFF"/>
-                <w:sz w:val="18"/>
-              </w:rPr>
-              <w:t>Gap</w:t>
-            </w:r>
-          </w:p>
-        </w:tc>
-        <w:tc>
-          <w:tcPr>
-            <w:tcW w:type="dxa" w:w="2448"/>
-          </w:tcPr>
-          <w:p>
-            <w:r/>
-            <w:r>
-              <w:rPr>
-                <w:b w:val="0"/>
-                <w:sz w:val="16"/>
-              </w:rPr>
-              <w:t>-</w:t>
-            </w:r>
-          </w:p>
-        </w:tc>
-      </w:tr>
-      <w:tr>
-        <w:tc>
-          <w:tcPr>
-            <w:tcW w:type="dxa" w:w="2304"/>
-          </w:tcPr>
-          <w:p>
-            <w:r/>
-            <w:r>
-              <w:rPr>
-                <w:b/>
-                <w:sz w:val="18"/>
-              </w:rPr>
               <w:t>Backlog report (planned belum dibooking)</w:t>
             </w:r>
           </w:p>
@@ -4011,7 +3942,7 @@
                 <w:b w:val="0"/>
                 <w:sz w:val="18"/>
               </w:rPr>
-              <w:t>Excel export; AI Charts; Data Warehouse (Enterprise)</w:t>
+              <w:t>Excel export; report kustom; Data Warehouse (Enterprise)</w:t>
             </w:r>
           </w:p>
         </w:tc>
@@ -4252,464 +4183,7 @@
           <w:color w:val="0F172A"/>
           <w:sz w:val="24"/>
         </w:rPr>
-        <w:t>7. AI / Automation (Copilot)</w:t>
-      </w:r>
-    </w:p>
-    <w:tbl>
-      <w:tblPr>
-        <w:tblStyle w:val="TableGrid"/>
-        <w:tblW w:type="auto" w:w="0"/>
-        <w:jc w:val="center"/>
-        <w:tblLook w:firstColumn="1" w:firstRow="1" w:lastColumn="0" w:lastRow="0" w:noHBand="0" w:noVBand="1" w:val="04A0"/>
-      </w:tblPr>
-      <w:tblGrid>
-        <w:gridCol w:w="2102"/>
-        <w:gridCol w:w="2102"/>
-        <w:gridCol w:w="2102"/>
-        <w:gridCol w:w="2102"/>
-        <w:gridCol w:w="2102"/>
-      </w:tblGrid>
-      <w:tr>
-        <w:tc>
-          <w:tcPr>
-            <w:tcW w:type="dxa" w:w="2304"/>
-            <w:shd w:val="clear" w:color="auto" w:fill="0F172A"/>
-          </w:tcPr>
-          <w:p>
-            <w:r/>
-            <w:r>
-              <w:rPr>
-                <w:b/>
-                <w:color w:val="FFFFFF"/>
-                <w:sz w:val="18"/>
-              </w:rPr>
-              <w:t>Fitur</w:t>
-            </w:r>
-          </w:p>
-        </w:tc>
-        <w:tc>
-          <w:tcPr>
-            <w:tcW w:type="dxa" w:w="3168"/>
-            <w:shd w:val="clear" w:color="auto" w:fill="0F172A"/>
-          </w:tcPr>
-          <w:p>
-            <w:r/>
-            <w:r>
-              <w:rPr>
-                <w:b/>
-                <w:color w:val="FFFFFF"/>
-                <w:sz w:val="18"/>
-              </w:rPr>
-              <w:t>PSOhub</w:t>
-            </w:r>
-          </w:p>
-        </w:tc>
-        <w:tc>
-          <w:tcPr>
-            <w:tcW w:type="dxa" w:w="3456"/>
-            <w:shd w:val="clear" w:color="auto" w:fill="0F172A"/>
-          </w:tcPr>
-          <w:p>
-            <w:r/>
-            <w:r>
-              <w:rPr>
-                <w:b/>
-                <w:color w:val="FFFFFF"/>
-                <w:sz w:val="18"/>
-              </w:rPr>
-              <w:t>SecureProfit Hub</w:t>
-            </w:r>
-          </w:p>
-        </w:tc>
-        <w:tc>
-          <w:tcPr>
-            <w:tcW w:type="dxa" w:w="1008"/>
-            <w:shd w:val="clear" w:color="auto" w:fill="0F172A"/>
-          </w:tcPr>
-          <w:p>
-            <w:pPr>
-              <w:jc w:val="center"/>
-            </w:pPr>
-            <w:r/>
-            <w:r>
-              <w:rPr>
-                <w:b/>
-                <w:color w:val="FFFFFF"/>
-                <w:sz w:val="18"/>
-              </w:rPr>
-              <w:t>Status</w:t>
-            </w:r>
-          </w:p>
-        </w:tc>
-        <w:tc>
-          <w:tcPr>
-            <w:tcW w:type="dxa" w:w="2448"/>
-            <w:shd w:val="clear" w:color="auto" w:fill="0F172A"/>
-          </w:tcPr>
-          <w:p>
-            <w:r/>
-            <w:r>
-              <w:rPr>
-                <w:b/>
-                <w:color w:val="FFFFFF"/>
-                <w:sz w:val="18"/>
-              </w:rPr>
-              <w:t>Catatan</w:t>
-            </w:r>
-          </w:p>
-        </w:tc>
-      </w:tr>
-      <w:tr>
-        <w:tc>
-          <w:tcPr>
-            <w:tcW w:type="dxa" w:w="2304"/>
-          </w:tcPr>
-          <w:p>
-            <w:r/>
-            <w:r>
-              <w:rPr>
-                <w:b/>
-                <w:sz w:val="18"/>
-              </w:rPr>
-              <w:t>AI assistant / Copilot</w:t>
-            </w:r>
-          </w:p>
-        </w:tc>
-        <w:tc>
-          <w:tcPr>
-            <w:tcW w:type="dxa" w:w="3168"/>
-          </w:tcPr>
-          <w:p>
-            <w:r/>
-            <w:r>
-              <w:rPr>
-                <w:b w:val="0"/>
-                <w:sz w:val="18"/>
-              </w:rPr>
-              <w:t>AI Copilot 24/7 (review, notify, analytics)</w:t>
-            </w:r>
-          </w:p>
-        </w:tc>
-        <w:tc>
-          <w:tcPr>
-            <w:tcW w:type="dxa" w:w="3456"/>
-          </w:tcPr>
-          <w:p>
-            <w:r/>
-            <w:r>
-              <w:rPr>
-                <w:b w:val="0"/>
-                <w:sz w:val="18"/>
-              </w:rPr>
-              <w:t>Belum ada</w:t>
-            </w:r>
-          </w:p>
-        </w:tc>
-        <w:tc>
-          <w:tcPr>
-            <w:tcW w:type="dxa" w:w="1008"/>
-            <w:shd w:val="clear" w:color="auto" w:fill="DC2626"/>
-          </w:tcPr>
-          <w:p>
-            <w:pPr>
-              <w:jc w:val="center"/>
-            </w:pPr>
-            <w:r/>
-            <w:r>
-              <w:rPr>
-                <w:b/>
-                <w:color w:val="FFFFFF"/>
-                <w:sz w:val="18"/>
-              </w:rPr>
-              <w:t>Gap</w:t>
-            </w:r>
-          </w:p>
-        </w:tc>
-        <w:tc>
-          <w:tcPr>
-            <w:tcW w:type="dxa" w:w="2448"/>
-          </w:tcPr>
-          <w:p>
-            <w:r/>
-            <w:r>
-              <w:rPr>
-                <w:b w:val="0"/>
-                <w:sz w:val="16"/>
-              </w:rPr>
-              <w:t>Diferensiator utama PSOhub</w:t>
-            </w:r>
-          </w:p>
-        </w:tc>
-      </w:tr>
-      <w:tr>
-        <w:tc>
-          <w:tcPr>
-            <w:tcW w:type="dxa" w:w="2304"/>
-          </w:tcPr>
-          <w:p>
-            <w:r/>
-            <w:r>
-              <w:rPr>
-                <w:b/>
-                <w:sz w:val="18"/>
-              </w:rPr>
-              <w:t>AI natural language data query</w:t>
-            </w:r>
-          </w:p>
-        </w:tc>
-        <w:tc>
-          <w:tcPr>
-            <w:tcW w:type="dxa" w:w="3168"/>
-          </w:tcPr>
-          <w:p>
-            <w:r/>
-            <w:r>
-              <w:rPr>
-                <w:b w:val="0"/>
-                <w:sz w:val="18"/>
-              </w:rPr>
-              <w:t>AI Data Analytics - tanya data natural language</w:t>
-            </w:r>
-          </w:p>
-        </w:tc>
-        <w:tc>
-          <w:tcPr>
-            <w:tcW w:type="dxa" w:w="3456"/>
-          </w:tcPr>
-          <w:p>
-            <w:r/>
-            <w:r>
-              <w:rPr>
-                <w:b w:val="0"/>
-                <w:sz w:val="18"/>
-              </w:rPr>
-              <w:t>Belum ada</w:t>
-            </w:r>
-          </w:p>
-        </w:tc>
-        <w:tc>
-          <w:tcPr>
-            <w:tcW w:type="dxa" w:w="1008"/>
-            <w:shd w:val="clear" w:color="auto" w:fill="DC2626"/>
-          </w:tcPr>
-          <w:p>
-            <w:pPr>
-              <w:jc w:val="center"/>
-            </w:pPr>
-            <w:r/>
-            <w:r>
-              <w:rPr>
-                <w:b/>
-                <w:color w:val="FFFFFF"/>
-                <w:sz w:val="18"/>
-              </w:rPr>
-              <w:t>Gap</w:t>
-            </w:r>
-          </w:p>
-        </w:tc>
-        <w:tc>
-          <w:tcPr>
-            <w:tcW w:type="dxa" w:w="2448"/>
-          </w:tcPr>
-          <w:p>
-            <w:r/>
-            <w:r>
-              <w:rPr>
-                <w:b w:val="0"/>
-                <w:sz w:val="16"/>
-              </w:rPr>
-              <w:t>-</w:t>
-            </w:r>
-          </w:p>
-        </w:tc>
-      </w:tr>
-      <w:tr>
-        <w:tc>
-          <w:tcPr>
-            <w:tcW w:type="dxa" w:w="2304"/>
-          </w:tcPr>
-          <w:p>
-            <w:r/>
-            <w:r>
-              <w:rPr>
-                <w:b/>
-                <w:sz w:val="18"/>
-              </w:rPr>
-              <w:t>AI auto-scheduling</w:t>
-            </w:r>
-          </w:p>
-        </w:tc>
-        <w:tc>
-          <w:tcPr>
-            <w:tcW w:type="dxa" w:w="3168"/>
-          </w:tcPr>
-          <w:p>
-            <w:r/>
-            <w:r>
-              <w:rPr>
-                <w:b w:val="0"/>
-                <w:sz w:val="18"/>
-              </w:rPr>
-              <w:t>AI Scheduling (Enterprise)</w:t>
-            </w:r>
-          </w:p>
-        </w:tc>
-        <w:tc>
-          <w:tcPr>
-            <w:tcW w:type="dxa" w:w="3456"/>
-          </w:tcPr>
-          <w:p>
-            <w:r/>
-            <w:r>
-              <w:rPr>
-                <w:b w:val="0"/>
-                <w:sz w:val="18"/>
-              </w:rPr>
-              <w:t>Belum ada</w:t>
-            </w:r>
-          </w:p>
-        </w:tc>
-        <w:tc>
-          <w:tcPr>
-            <w:tcW w:type="dxa" w:w="1008"/>
-            <w:shd w:val="clear" w:color="auto" w:fill="DC2626"/>
-          </w:tcPr>
-          <w:p>
-            <w:pPr>
-              <w:jc w:val="center"/>
-            </w:pPr>
-            <w:r/>
-            <w:r>
-              <w:rPr>
-                <w:b/>
-                <w:color w:val="FFFFFF"/>
-                <w:sz w:val="18"/>
-              </w:rPr>
-              <w:t>Gap</w:t>
-            </w:r>
-          </w:p>
-        </w:tc>
-        <w:tc>
-          <w:tcPr>
-            <w:tcW w:type="dxa" w:w="2448"/>
-          </w:tcPr>
-          <w:p>
-            <w:r/>
-            <w:r>
-              <w:rPr>
-                <w:b w:val="0"/>
-                <w:sz w:val="16"/>
-              </w:rPr>
-              <w:t>-</w:t>
-            </w:r>
-          </w:p>
-        </w:tc>
-      </w:tr>
-      <w:tr>
-        <w:tc>
-          <w:tcPr>
-            <w:tcW w:type="dxa" w:w="2304"/>
-          </w:tcPr>
-          <w:p>
-            <w:r/>
-            <w:r>
-              <w:rPr>
-                <w:b/>
-                <w:sz w:val="18"/>
-              </w:rPr>
-              <w:t>AI charts &amp; reporting</w:t>
-            </w:r>
-          </w:p>
-        </w:tc>
-        <w:tc>
-          <w:tcPr>
-            <w:tcW w:type="dxa" w:w="3168"/>
-          </w:tcPr>
-          <w:p>
-            <w:r/>
-            <w:r>
-              <w:rPr>
-                <w:b w:val="0"/>
-                <w:sz w:val="18"/>
-              </w:rPr>
-              <w:t>AI Charts (Professional)</w:t>
-            </w:r>
-          </w:p>
-        </w:tc>
-        <w:tc>
-          <w:tcPr>
-            <w:tcW w:type="dxa" w:w="3456"/>
-          </w:tcPr>
-          <w:p>
-            <w:r/>
-            <w:r>
-              <w:rPr>
-                <w:b w:val="0"/>
-                <w:sz w:val="18"/>
-              </w:rPr>
-              <w:t>Belum ada</w:t>
-            </w:r>
-          </w:p>
-        </w:tc>
-        <w:tc>
-          <w:tcPr>
-            <w:tcW w:type="dxa" w:w="1008"/>
-            <w:shd w:val="clear" w:color="auto" w:fill="DC2626"/>
-          </w:tcPr>
-          <w:p>
-            <w:pPr>
-              <w:jc w:val="center"/>
-            </w:pPr>
-            <w:r/>
-            <w:r>
-              <w:rPr>
-                <w:b/>
-                <w:color w:val="FFFFFF"/>
-                <w:sz w:val="18"/>
-              </w:rPr>
-              <w:t>Gap</w:t>
-            </w:r>
-          </w:p>
-        </w:tc>
-        <w:tc>
-          <w:tcPr>
-            <w:tcW w:type="dxa" w:w="2448"/>
-          </w:tcPr>
-          <w:p>
-            <w:r/>
-            <w:r>
-              <w:rPr>
-                <w:b w:val="0"/>
-                <w:sz w:val="16"/>
-              </w:rPr>
-              <w:t>-</w:t>
-            </w:r>
-          </w:p>
-        </w:tc>
-      </w:tr>
-    </w:tbl>
-    <w:p>
-      <w:pPr>
-        <w:spacing w:after="40"/>
-      </w:pPr>
-      <w:r>
-        <w:rPr>
-          <w:b w:val="0"/>
-          <w:sz w:val="20"/>
-        </w:rPr>
-      </w:r>
-    </w:p>
-    <w:p>
-      <w:pPr>
-        <w:spacing w:before="160" w:after="60"/>
-      </w:pPr>
-      <w:r>
-        <w:rPr>
-          <w:b/>
-          <w:color w:val="0F172A"/>
-          <w:sz w:val="24"/>
-        </w:rPr>
-        <w:t>8. Integrations</w:t>
+        <w:t>7. Integrations</w:t>
       </w:r>
     </w:p>
     <w:tbl>
@@ -5330,7 +4804,7 @@
           <w:color w:val="0F172A"/>
           <w:sz w:val="24"/>
         </w:rPr>
-        <w:t>9. Multi-tenancy, Security &amp; Audit</w:t>
+        <w:t>8. Multi-tenancy, Security &amp; Audit</w:t>
       </w:r>
     </w:p>
     <w:tbl>
@@ -5787,7 +5261,7 @@
           <w:color w:val="0F172A"/>
           <w:sz w:val="24"/>
         </w:rPr>
-        <w:t>10. Onboarding &amp; Support</w:t>
+        <w:t>9. Onboarding &amp; Support</w:t>
       </w:r>
     </w:p>
     <w:tbl>
@@ -6213,25 +5687,6 @@
           <w:b/>
           <w:sz w:val="18"/>
         </w:rPr>
-        <w:t xml:space="preserve">AI auto-scheduling resource (3. Resource &amp; Capacity Management) </w:t>
-      </w:r>
-      <w:r>
-        <w:rPr>
-          <w:sz w:val="18"/>
-        </w:rPr>
-        <w:t>- PSOhub: AI Scheduling (Enterprise) - auto-assign</w:t>
-      </w:r>
-    </w:p>
-    <w:p>
-      <w:pPr>
-        <w:pStyle w:val="ListBullet"/>
-        <w:spacing w:after="20"/>
-      </w:pPr>
-      <w:r>
-        <w:rPr>
-          <w:b/>
-          <w:sz w:val="18"/>
-        </w:rPr>
         <w:t xml:space="preserve">Backlog report (planned belum dibooking) (3. Resource &amp; Capacity Management) </w:t>
       </w:r>
       <w:r>
@@ -6308,83 +5763,7 @@
           <w:b/>
           <w:sz w:val="18"/>
         </w:rPr>
-        <w:t xml:space="preserve">AI assistant / Copilot (7. AI / Automation (Copilot)) </w:t>
-      </w:r>
-      <w:r>
-        <w:rPr>
-          <w:sz w:val="18"/>
-        </w:rPr>
-        <w:t>- PSOhub: AI Copilot 24/7 (review, notify, analytics)</w:t>
-      </w:r>
-    </w:p>
-    <w:p>
-      <w:pPr>
-        <w:pStyle w:val="ListBullet"/>
-        <w:spacing w:after="20"/>
-      </w:pPr>
-      <w:r>
-        <w:rPr>
-          <w:b/>
-          <w:sz w:val="18"/>
-        </w:rPr>
-        <w:t xml:space="preserve">AI natural language data query (7. AI / Automation (Copilot)) </w:t>
-      </w:r>
-      <w:r>
-        <w:rPr>
-          <w:sz w:val="18"/>
-        </w:rPr>
-        <w:t>- PSOhub: AI Data Analytics - tanya data natural language</w:t>
-      </w:r>
-    </w:p>
-    <w:p>
-      <w:pPr>
-        <w:pStyle w:val="ListBullet"/>
-        <w:spacing w:after="20"/>
-      </w:pPr>
-      <w:r>
-        <w:rPr>
-          <w:b/>
-          <w:sz w:val="18"/>
-        </w:rPr>
-        <w:t xml:space="preserve">AI auto-scheduling (7. AI / Automation (Copilot)) </w:t>
-      </w:r>
-      <w:r>
-        <w:rPr>
-          <w:sz w:val="18"/>
-        </w:rPr>
-        <w:t>- PSOhub: AI Scheduling (Enterprise)</w:t>
-      </w:r>
-    </w:p>
-    <w:p>
-      <w:pPr>
-        <w:pStyle w:val="ListBullet"/>
-        <w:spacing w:after="20"/>
-      </w:pPr>
-      <w:r>
-        <w:rPr>
-          <w:b/>
-          <w:sz w:val="18"/>
-        </w:rPr>
-        <w:t xml:space="preserve">AI charts &amp; reporting (7. AI / Automation (Copilot)) </w:t>
-      </w:r>
-      <w:r>
-        <w:rPr>
-          <w:sz w:val="18"/>
-        </w:rPr>
-        <w:t>- PSOhub: AI Charts (Professional)</w:t>
-      </w:r>
-    </w:p>
-    <w:p>
-      <w:pPr>
-        <w:pStyle w:val="ListBullet"/>
-        <w:spacing w:after="20"/>
-      </w:pPr>
-      <w:r>
-        <w:rPr>
-          <w:b/>
-          <w:sz w:val="18"/>
-        </w:rPr>
-        <w:t xml:space="preserve">CRM integration (8. Integrations) </w:t>
+        <w:t xml:space="preserve">CRM integration (7. Integrations) </w:t>
       </w:r>
       <w:r>
         <w:rPr>
@@ -6403,7 +5782,7 @@
           <w:b/>
           <w:sz w:val="18"/>
         </w:rPr>
-        <w:t xml:space="preserve">Collaboration (Teams/Slack) (8. Integrations) </w:t>
+        <w:t xml:space="preserve">Collaboration (Teams/Slack) (7. Integrations) </w:t>
       </w:r>
       <w:r>
         <w:rPr>
@@ -6422,7 +5801,7 @@
           <w:b/>
           <w:sz w:val="18"/>
         </w:rPr>
-        <w:t xml:space="preserve">SSO (Google/Microsoft) (8. Integrations) </w:t>
+        <w:t xml:space="preserve">SSO (Google/Microsoft) (7. Integrations) </w:t>
       </w:r>
       <w:r>
         <w:rPr>
@@ -6441,7 +5820,7 @@
           <w:b/>
           <w:sz w:val="18"/>
         </w:rPr>
-        <w:t xml:space="preserve">Zapier / no-code automation (8. Integrations) </w:t>
+        <w:t xml:space="preserve">Zapier / no-code automation (7. Integrations) </w:t>
       </w:r>
       <w:r>
         <w:rPr>
@@ -6460,7 +5839,7 @@
           <w:b/>
           <w:sz w:val="18"/>
         </w:rPr>
-        <w:t xml:space="preserve">Knowledge base / akademi (10. Onboarding &amp; Support) </w:t>
+        <w:t xml:space="preserve">Knowledge base / akademi (9. Onboarding &amp; Support) </w:t>
       </w:r>
       <w:r>
         <w:rPr>
@@ -6479,7 +5858,7 @@
           <w:b/>
           <w:sz w:val="18"/>
         </w:rPr>
-        <w:t xml:space="preserve">In-app chat support (10. Onboarding &amp; Support) </w:t>
+        <w:t xml:space="preserve">In-app chat support (9. Onboarding &amp; Support) </w:t>
       </w:r>
       <w:r>
         <w:rPr>
@@ -6701,7 +6080,7 @@
           <w:b/>
           <w:sz w:val="18"/>
         </w:rPr>
-        <w:t xml:space="preserve">Accounting integration (8. Integrations) </w:t>
+        <w:t xml:space="preserve">Accounting integration (7. Integrations) </w:t>
       </w:r>
       <w:r>
         <w:rPr>
@@ -6720,7 +6099,7 @@
           <w:b/>
           <w:sz w:val="18"/>
         </w:rPr>
-        <w:t xml:space="preserve">Public API (8. Integrations) </w:t>
+        <w:t xml:space="preserve">Public API (7. Integrations) </w:t>
       </w:r>
       <w:r>
         <w:rPr>
@@ -6739,7 +6118,7 @@
           <w:b/>
           <w:sz w:val="18"/>
         </w:rPr>
-        <w:t xml:space="preserve">Guest portal eksternal (9. Multi-tenancy, Security &amp; Audit) </w:t>
+        <w:t xml:space="preserve">Guest portal eksternal (8. Multi-tenancy, Security &amp; Audit) </w:t>
       </w:r>
       <w:r>
         <w:rPr>
@@ -6758,7 +6137,7 @@
           <w:b/>
           <w:sz w:val="18"/>
         </w:rPr>
-        <w:t xml:space="preserve">Customer success agent (10. Onboarding &amp; Support) </w:t>
+        <w:t xml:space="preserve">Customer success agent (9. Onboarding &amp; Support) </w:t>
       </w:r>
       <w:r>
         <w:rPr>
@@ -6937,18 +6316,6 @@
           <w:sz w:val="22"/>
         </w:rPr>
         <w:t>Prioritas Jangka Panjang (&gt; 2 kuartal)</w:t>
-      </w:r>
-    </w:p>
-    <w:p>
-      <w:pPr>
-        <w:pStyle w:val="ListBullet"/>
-        <w:spacing w:after="20"/>
-      </w:pPr>
-      <w:r>
-        <w:rPr>
-          <w:sz w:val="20"/>
-        </w:rPr>
-        <w:t>AI Copilot: review proyek otomatis, AI data analytics (natural language), AI charts, AI scheduling.</w:t>
       </w:r>
     </w:p>
     <w:p>

</xml_diff>